<commit_message>
examples(visualize): compare's redline, its pages and changed-pages PDF
Co-Authored-By: Claude Opus 5.5 <noreply@anthropic.com>
Claude-Session: https://claude.ai/code/session_011bYN5QY25n4bVER1Pv4xvv
</commit_message>
<xml_diff>
--- a/examples/cli/visualize/out/compare.docx
+++ b/examples/cli/visualize/out/compare.docx
@@ -111,25 +111,11 @@
         <w:tblStyle w:val="TableGrid"/>
         <w:tblW w:w="5000" w:type="pct"/>
         <w:tblLook w:val="04A0" w:firstRow="1" w:lastRow="0" w:firstColumn="1" w:lastColumn="0" w:noHBand="0" w:noVBand="1"/>
-        <w:tblPrChange w:id="6" w:author="Agent" w:date="2026-10-02T15:00:00Z">
-          <w:tblPr>
-            <w:tblStyle w:val="TableGrid"/>
-            <w:tblW w:w="5000" w:type="pct"/>
-            <w:tblLook w:val="04A0" w:firstRow="1" w:lastRow="0" w:firstColumn="1" w:lastColumn="0" w:noHBand="0" w:noVBand="1"/>
-          </w:tblPr>
-        </w:tblPrChange>
       </w:tblPr>
       <w:tblGrid>
         <w:gridCol w:w="3120"/>
         <w:gridCol w:w="3120"/>
         <w:gridCol w:w="3120"/>
-        <w:tblGridChange w:id="7">
-          <w:tblGrid>
-            <w:gridCol w:w="3120"/>
-            <w:gridCol w:w="3120"/>
-            <w:gridCol w:w="3120"/>
-          </w:tblGrid>
-        </w:tblGridChange>
       </w:tblGrid>
       <w:tr>
         <w:trPr>
@@ -243,7 +229,7 @@
       <w:r>
         <w:t>Each party shall keep the other's Confidential Information secret</w:t>
       </w:r>
-      <w:ins w:author="Agent" w:id="8" w:date="2026-10-02T15:00:00Z">
+      <w:ins w:author="Agent" w:id="6" w:date="2026-10-02T15:00:00Z">
         <w:r>
           <w:t xml:space="preserve"> for three years after this Agreement ends</w:t>
         </w:r>

</xml_diff>